<commit_message>
change name sankey plot
</commit_message>
<xml_diff>
--- a/manuscript/cleaning_file_MOFA.docx
+++ b/manuscript/cleaning_file_MOFA.docx
@@ -132,51 +132,6 @@
       </w:pPr>
       <w:r>
         <w:rPr/>
-      </w:r>
-    </w:p>
-    <w:p>
-      <w:pPr>
-        <w:pStyle w:val="Normal"/>
-        <w:bidi w:val="0"/>
-        <w:jc w:val="start"/>
-        <w:rPr/>
-      </w:pPr>
-      <w:r>
-        <w:rPr/>
-        <w:t>/home/flora.mikaeloff/Projects/Hallmarks/data/AML_MOFAplus_top_factors_v04_f600_2.xlsx</w:t>
-      </w:r>
-    </w:p>
-    <w:p>
-      <w:pPr>
-        <w:pStyle w:val="Normal"/>
-        <w:bidi w:val="0"/>
-        <w:jc w:val="start"/>
-        <w:rPr/>
-      </w:pPr>
-      <w:r>
-        <w:rPr/>
-      </w:r>
-    </w:p>
-    <w:p>
-      <w:pPr>
-        <w:pStyle w:val="Normal"/>
-        <w:bidi w:val="0"/>
-        <w:jc w:val="start"/>
-        <w:rPr/>
-      </w:pPr>
-      <w:r>
-        <w:rPr/>
-      </w:r>
-    </w:p>
-    <w:p>
-      <w:pPr>
-        <w:pStyle w:val="Normal"/>
-        <w:bidi w:val="0"/>
-        <w:jc w:val="start"/>
-        <w:rPr/>
-      </w:pPr>
-      <w:r>
-        <w:rPr/>
         <w:t>CITE-seq</w:t>
       </w:r>
     </w:p>
@@ -190,53 +145,6 @@
       <w:r>
         <w:rPr/>
         <w:t>"/home/flomik/Data/data_francesco/Wells_combined_sctransformed.rds"</w:t>
-      </w:r>
-    </w:p>
-    <w:p>
-      <w:pPr>
-        <w:pStyle w:val="Normal"/>
-        <w:bidi w:val="0"/>
-        <w:jc w:val="start"/>
-        <w:rPr/>
-      </w:pPr>
-      <w:r>
-        <w:rPr/>
-      </w:r>
-    </w:p>
-    <w:p>
-      <w:pPr>
-        <w:pStyle w:val="Normal"/>
-        <w:bidi w:val="0"/>
-        <w:jc w:val="start"/>
-        <w:rPr/>
-      </w:pPr>
-      <w:r>
-        <w:rPr/>
-        <w:t>Gene sets</w:t>
-      </w:r>
-    </w:p>
-    <w:p>
-      <w:pPr>
-        <w:pStyle w:val="Normal"/>
-        <w:bidi w:val="0"/>
-        <w:jc w:val="start"/>
-        <w:rPr/>
-      </w:pPr>
-      <w:r>
-        <w:rPr/>
-        <w:t>/home/flora.mikaeloff/Projects/Hallmarks/data/AMLCellType_Genesets.gmt.txt</w:t>
-      </w:r>
-    </w:p>
-    <w:p>
-      <w:pPr>
-        <w:pStyle w:val="Normal"/>
-        <w:bidi w:val="0"/>
-        <w:jc w:val="start"/>
-        <w:rPr/>
-      </w:pPr>
-      <w:r>
-        <w:rPr/>
-        <w:t>/home/flora.mikaeloff/Projects/Hallmarks/data/Van_Galen_markers/mmc3.xlsx</w:t>
       </w:r>
     </w:p>
     <w:p>
@@ -286,18 +194,6 @@
       </w:pPr>
       <w:r>
         <w:rPr/>
-        <w:t xml:space="preserve">"results/data_ADT_cell_markers_norm.csv" → </w:t>
-      </w:r>
-    </w:p>
-    <w:p>
-      <w:pPr>
-        <w:pStyle w:val="Normal"/>
-        <w:bidi w:val="0"/>
-        <w:jc w:val="start"/>
-        <w:rPr/>
-      </w:pPr>
-      <w:r>
-        <w:rPr/>
         <w:t>/home/flomik/Code/MOFA_AML/data/server/ data_ADT_cell_markers_norm.csv</w:t>
       </w:r>
     </w:p>
@@ -310,29 +206,6 @@
       </w:pPr>
       <w:r>
         <w:rPr/>
-      </w:r>
-    </w:p>
-    <w:p>
-      <w:pPr>
-        <w:pStyle w:val="Normal"/>
-        <w:bidi w:val="0"/>
-        <w:jc w:val="start"/>
-        <w:rPr/>
-      </w:pPr>
-      <w:r>
-        <w:rPr/>
-        <w:t xml:space="preserve">"results/scores_cells_and_factors_CITE_seq_clean.csv" → </w:t>
-      </w:r>
-    </w:p>
-    <w:p>
-      <w:pPr>
-        <w:pStyle w:val="Normal"/>
-        <w:bidi w:val="0"/>
-        <w:jc w:val="start"/>
-        <w:rPr/>
-      </w:pPr>
-      <w:r>
-        <w:rPr/>
         <w:t>/home/flomik/Code/MOFA_AML/data/server/scores_cells_and_factors_CITE_seq_clean.csv</w:t>
       </w:r>
     </w:p>
@@ -761,11 +634,7 @@
       </w:pPr>
       <w:r>
         <w:rPr/>
-        <w:t xml:space="preserve">- </w:t>
-      </w:r>
-      <w:r>
-        <w:rPr/>
-        <w:t>selection 600 top factors</w:t>
+        <w:t>- selection 600 top factors</w:t>
       </w:r>
     </w:p>
     <w:sectPr>

</xml_diff>